<commit_message>
fix(fixtures): recover embedded submission block whitespace-insensitively
Uploaded case PDFs still recommended binder_A on the Pages demo with a live
model. PDF.js can split or inject whitespace into the base64 marker line, so
the browser could not recover the embedded submission block and fell through
to the LLM (the local server on :8099 was also stale).

- fixtures: close the block with :END-SUBMISSION-DATA; every case with a
  document carries a block (empty for 13-halt-empty, keeping halt cases key-free)
- nodes/parse.py: recover the block whitespace-insensitively (and for pre-parsed text)
- nodes/extract.py: short-circuit when structured_hint is present, empty allowed
- docs/index.html: same recovery in the browser, per-case PDF/DOCX/EML download
  links, correct extraction label
- scripts/verify_fixture_uploads.py: 29 cases x 3 formats == dropdown, no API key
</commit_message>
<xml_diff>
--- a/samples/fixtures/docx/case-13-halt-empty.docx
+++ b/samples/fixtures/docx/case-13-halt-empty.docx
@@ -30,6 +30,11 @@
     <w:p>
       <w:r>
         <w:t>Expected: ?</w:t>
+      </w:r>
+    </w:p>
+    <w:p>
+      <w:r>
+        <w:t>SUBMISSION-DATA-B64: e30= :END-SUBMISSION-DATA</w:t>
       </w:r>
     </w:p>
     <w:sectPr>

</xml_diff>